<commit_message>
chore: 작업 자동 저장 (2026-08-19 17:20)
</commit_message>
<xml_diff>
--- a/docs/government-project/04_중간보고서.docx
+++ b/docs/government-project/04_중간보고서.docx
@@ -244,7 +244,7 @@
                 <w:sz w:val="20"/>
                 <w:szCs w:val="20"/>
               </w:rPr>
-              <w:t xml:space="preserve">2026년 4월 30일 (착수 후 1개월 시점)</w:t>
+              <w:t>2026년 8월 19일 (착수 후 5개월 시점)</w:t>
             </w:r>
           </w:p>
         </w:tc>
@@ -369,7 +369,7 @@
           <w:sz w:val="20"/>
           <w:szCs w:val="20"/>
         </w:rPr>
-        <w:t xml:space="preserve">기준일 2026년 4월 30일 기준, 전체 기능 구현 진척률은 74% (완료) + 26% (부분구현)로, 미구현 기능은 없다.</w:t>
+        <w:t>기준일 2026년 8월 19일 기준, 전체 기능 구현 진척률은 96% (완료 22/23) + 4% (부분구현 1/23)로, 미구현 기능은 없다. 착수 시 부분구현으로 분류했던 6개 기능 중 5개가 완료로 전환되었다.</w:t>
       </w:r>
     </w:p>
     <w:p>
@@ -382,7 +382,7 @@
           <w:sz w:val="20"/>
           <w:szCs w:val="20"/>
         </w:rPr>
-        <w:t xml:space="preserve">사업 기간 기준 진척률: 4월/8개월 = 12.5% (초기 단계)이나, 기능 구현은 사전 개발로 74% 완료 상태.</w:t>
+        <w:t>사업 기간 기준 진척률: 5개월/8개월 = 62.5% 경과. 기능 구현은 96% 완료 상태이며, 플랫폼은 6월 정식 배포 이후 실서비스로 운영 중이다.</w:t>
       </w:r>
     </w:p>
     <w:p>
@@ -574,7 +574,7 @@
                 <w:sz w:val="18"/>
                 <w:szCs w:val="18"/>
               </w:rPr>
-              <w:t xml:space="preserve">74% (17/23 기능)</w:t>
+              <w:t>96% (22/23 기능)</w:t>
             </w:r>
           </w:p>
         </w:tc>
@@ -675,7 +675,7 @@
                 <w:sz w:val="18"/>
                 <w:szCs w:val="18"/>
               </w:rPr>
-              <w:t xml:space="preserve">26% (6/23 기능)</w:t>
+              <w:t>4% (1/23 기능)</w:t>
             </w:r>
           </w:p>
         </w:tc>
@@ -708,7 +708,7 @@
                 <w:sz w:val="18"/>
                 <w:szCs w:val="18"/>
               </w:rPr>
-              <w:t xml:space="preserve">화상 내 실시간 번역 자막, 예약 리마인더 자동화, 사후관리 AI 감지, 러시아어·카자흐어 UI 완성, 실시간 푸시 알림</w:t>
+              <w:t>예약 리마인더 자동화(의료진 일정 연동 잔여)</w:t>
             </w:r>
           </w:p>
         </w:tc>
@@ -3187,7 +3187,7 @@
           <w:sz w:val="20"/>
           <w:szCs w:val="20"/>
         </w:rPr>
-        <w:t xml:space="preserve">2026년 4월 30일 기준 — 시스템 구축 단계이므로 운영 KPI는 측정 전 상태이다.</w:t>
+        <w:t>2026년 8월 19일 기준 — 플랫폼 구축·배포는 완료되어 운영 중이며, 운영 KPI는 실환자 유입 단계에 따라 집계된다.</w:t>
       </w:r>
     </w:p>
     <w:p>
@@ -9811,7 +9811,7 @@
                 <w:sz w:val="18"/>
                 <w:szCs w:val="18"/>
               </w:rPr>
-              <w:t xml:space="preserve">v0.9 [Draft]</w:t>
+              <w:t>v1.1</w:t>
             </w:r>
           </w:p>
         </w:tc>
@@ -9877,7 +9877,7 @@
                 <w:sz w:val="18"/>
                 <w:szCs w:val="18"/>
               </w:rPr>
-              <w:t xml:space="preserve">2026-04-30</w:t>
+              <w:t>2026-08-19</w:t>
             </w:r>
           </w:p>
         </w:tc>
@@ -12460,6 +12460,2472 @@
                 <w:rFonts w:eastAsia="맑은 고딕"/>
               </w:rPr>
               <w:t>운영데이터베이스 정확 집계(2026. 7. 27.)</w:t>
+            </w:r>
+          </w:p>
+        </w:tc>
+        <w:tc>
+          <w:tcPr>
+            <w:tcW w:type="dxa" w:w="2889"/>
+          </w:tcPr>
+          <w:p>
+            <w:r/>
+            <w:r>
+              <w:rPr>
+                <w:rFonts w:ascii="맑은 고딕" w:hAnsi="맑은 고딕"/>
+                <w:b w:val="0"/>
+                <w:sz w:val="18"/>
+                <w:rFonts w:eastAsia="맑은 고딕"/>
+              </w:rPr>
+              <w:t>실적 수치의 원천</w:t>
+            </w:r>
+          </w:p>
+        </w:tc>
+      </w:tr>
+    </w:tbl>
+    <w:p/>
+    <w:p>
+      <w:r>
+        <w:br w:type="page"/>
+      </w:r>
+    </w:p>
+    <w:p>
+      <w:r>
+        <w:rPr>
+          <w:rFonts w:ascii="맑은 고딕" w:hAnsi="맑은 고딕"/>
+          <w:b/>
+          <w:color w:val="00467F"/>
+          <w:sz w:val="28"/>
+          <w:rFonts w:eastAsia="맑은 고딕"/>
+        </w:rPr>
+        <w:t>부록. 현행 반영 (2026. 8. 19. 기준)</w:t>
+      </w:r>
+    </w:p>
+    <w:p>
+      <w:r>
+        <w:rPr>
+          <w:rFonts w:ascii="맑은 고딕" w:hAnsi="맑은 고딕"/>
+          <w:b w:val="0"/>
+          <w:sz w:val="20"/>
+          <w:rFonts w:eastAsia="맑은 고딕"/>
+        </w:rPr>
+        <w:t>본 부록은 문서 본문 작성 이후 변경된 사항을 현행 기준으로 반영한 것이다. 수치는 추정이 아니라 운영데이터베이스 정확 집계이며, 화면 경로는 실제 배포 코드 기준이다.</w:t>
+      </w:r>
+    </w:p>
+    <w:p/>
+    <w:p>
+      <w:r>
+        <w:rPr>
+          <w:rFonts w:ascii="맑은 고딕" w:hAnsi="맑은 고딕"/>
+          <w:b/>
+          <w:color w:val="00467F"/>
+          <w:sz w:val="24"/>
+          <w:rFonts w:eastAsia="맑은 고딕"/>
+        </w:rPr>
+        <w:t>1. 계정 계층 (7종)</w:t>
+      </w:r>
+    </w:p>
+    <w:p>
+      <w:r>
+        <w:rPr>
+          <w:rFonts w:ascii="맑은 고딕" w:hAnsi="맑은 고딕"/>
+          <w:b w:val="0"/>
+          <w:sz w:val="18"/>
+          <w:rFonts w:eastAsia="맑은 고딕"/>
+        </w:rPr>
+        <w:t>※ 의사는 계정 계층이 아니다. 화상상담 초대링크 게스트 또는 의료기관 계정으로 참여한다.</w:t>
+      </w:r>
+    </w:p>
+    <w:tbl>
+      <w:tblPr>
+        <w:tblW w:type="auto" w:w="0"/>
+        <w:tblLook w:firstColumn="1" w:firstRow="1" w:lastColumn="0" w:lastRow="0" w:noHBand="0" w:noVBand="1" w:val="04A0"/>
+        <w:tblBorders>
+          <w:top w:val="single" w:sz="4" w:color="999999"/>
+          <w:left w:val="single" w:sz="4" w:color="999999"/>
+          <w:bottom w:val="single" w:sz="4" w:color="999999"/>
+          <w:right w:val="single" w:sz="4" w:color="999999"/>
+          <w:insideH w:val="single" w:sz="4" w:color="999999"/>
+          <w:insideV w:val="single" w:sz="4" w:color="999999"/>
+        </w:tblBorders>
+      </w:tblPr>
+      <w:tblGrid>
+        <w:gridCol w:w="2166"/>
+        <w:gridCol w:w="2166"/>
+        <w:gridCol w:w="2166"/>
+        <w:gridCol w:w="2166"/>
+      </w:tblGrid>
+      <w:tr>
+        <w:tc>
+          <w:tcPr>
+            <w:tcW w:type="dxa" w:w="2166"/>
+            <w:shd w:val="clear" w:color="auto" w:fill="00467F"/>
+          </w:tcPr>
+          <w:p>
+            <w:r/>
+            <w:r>
+              <w:rPr>
+                <w:rFonts w:ascii="맑은 고딕" w:hAnsi="맑은 고딕"/>
+                <w:b/>
+                <w:color w:val="FFFFFF"/>
+                <w:sz w:val="18"/>
+                <w:rFonts w:eastAsia="맑은 고딕"/>
+              </w:rPr>
+              <w:t>계층</w:t>
+            </w:r>
+          </w:p>
+        </w:tc>
+        <w:tc>
+          <w:tcPr>
+            <w:tcW w:type="dxa" w:w="2166"/>
+            <w:shd w:val="clear" w:color="auto" w:fill="00467F"/>
+          </w:tcPr>
+          <w:p>
+            <w:r/>
+            <w:r>
+              <w:rPr>
+                <w:rFonts w:ascii="맑은 고딕" w:hAnsi="맑은 고딕"/>
+                <w:b/>
+                <w:color w:val="FFFFFF"/>
+                <w:sz w:val="18"/>
+                <w:rFonts w:eastAsia="맑은 고딕"/>
+              </w:rPr>
+              <w:t>권한 저장</w:t>
+            </w:r>
+          </w:p>
+        </w:tc>
+        <w:tc>
+          <w:tcPr>
+            <w:tcW w:type="dxa" w:w="2166"/>
+            <w:shd w:val="clear" w:color="auto" w:fill="00467F"/>
+          </w:tcPr>
+          <w:p>
+            <w:r/>
+            <w:r>
+              <w:rPr>
+                <w:rFonts w:ascii="맑은 고딕" w:hAnsi="맑은 고딕"/>
+                <w:b/>
+                <w:color w:val="FFFFFF"/>
+                <w:sz w:val="18"/>
+                <w:rFonts w:eastAsia="맑은 고딕"/>
+              </w:rPr>
+              <w:t>전용 화면</w:t>
+            </w:r>
+          </w:p>
+        </w:tc>
+        <w:tc>
+          <w:tcPr>
+            <w:tcW w:type="dxa" w:w="2166"/>
+            <w:shd w:val="clear" w:color="auto" w:fill="00467F"/>
+          </w:tcPr>
+          <w:p>
+            <w:r/>
+            <w:r>
+              <w:rPr>
+                <w:rFonts w:ascii="맑은 고딕" w:hAnsi="맑은 고딕"/>
+                <w:b/>
+                <w:color w:val="FFFFFF"/>
+                <w:sz w:val="18"/>
+                <w:rFonts w:eastAsia="맑은 고딕"/>
+              </w:rPr>
+              <w:t>설명</w:t>
+            </w:r>
+          </w:p>
+        </w:tc>
+      </w:tr>
+      <w:tr>
+        <w:tc>
+          <w:tcPr>
+            <w:tcW w:type="dxa" w:w="2166"/>
+          </w:tcPr>
+          <w:p>
+            <w:r/>
+            <w:r>
+              <w:rPr>
+                <w:rFonts w:ascii="맑은 고딕" w:hAnsi="맑은 고딕"/>
+                <w:b/>
+                <w:sz w:val="18"/>
+                <w:rFonts w:eastAsia="맑은 고딕"/>
+              </w:rPr>
+              <w:t>비회원(게스트)</w:t>
+            </w:r>
+          </w:p>
+        </w:tc>
+        <w:tc>
+          <w:tcPr>
+            <w:tcW w:type="dxa" w:w="2166"/>
+          </w:tcPr>
+          <w:p>
+            <w:r/>
+            <w:r>
+              <w:rPr>
+                <w:rFonts w:ascii="맑은 고딕" w:hAnsi="맑은 고딕"/>
+                <w:b w:val="0"/>
+                <w:sz w:val="18"/>
+                <w:rFonts w:eastAsia="맑은 고딕"/>
+              </w:rPr>
+              <w:t>초대링크 토큰</w:t>
+            </w:r>
+          </w:p>
+        </w:tc>
+        <w:tc>
+          <w:tcPr>
+            <w:tcW w:type="dxa" w:w="2166"/>
+          </w:tcPr>
+          <w:p>
+            <w:r/>
+            <w:r>
+              <w:rPr>
+                <w:rFonts w:ascii="맑은 고딕" w:hAnsi="맑은 고딕"/>
+                <w:b w:val="0"/>
+                <w:sz w:val="18"/>
+                <w:rFonts w:eastAsia="맑은 고딕"/>
+              </w:rPr>
+              <w:t>—</w:t>
+            </w:r>
+          </w:p>
+        </w:tc>
+        <w:tc>
+          <w:tcPr>
+            <w:tcW w:type="dxa" w:w="2166"/>
+          </w:tcPr>
+          <w:p>
+            <w:r/>
+            <w:r>
+              <w:rPr>
+                <w:rFonts w:ascii="맑은 고딕" w:hAnsi="맑은 고딕"/>
+                <w:b w:val="0"/>
+                <w:sz w:val="18"/>
+                <w:rFonts w:eastAsia="맑은 고딕"/>
+              </w:rPr>
+              <w:t>계정 없이 화상상담 초대링크로만 상담방 입장. 의료진·통역사가 이 방식으로 참여.</w:t>
+            </w:r>
+          </w:p>
+        </w:tc>
+      </w:tr>
+      <w:tr>
+        <w:tc>
+          <w:tcPr>
+            <w:tcW w:type="dxa" w:w="2166"/>
+          </w:tcPr>
+          <w:p>
+            <w:r/>
+            <w:r>
+              <w:rPr>
+                <w:rFonts w:ascii="맑은 고딕" w:hAnsi="맑은 고딕"/>
+                <w:b/>
+                <w:sz w:val="18"/>
+                <w:rFonts w:eastAsia="맑은 고딕"/>
+              </w:rPr>
+              <w:t>사용자(환자)</w:t>
+            </w:r>
+          </w:p>
+        </w:tc>
+        <w:tc>
+          <w:tcPr>
+            <w:tcW w:type="dxa" w:w="2166"/>
+          </w:tcPr>
+          <w:p>
+            <w:r/>
+            <w:r>
+              <w:rPr>
+                <w:rFonts w:ascii="맑은 고딕" w:hAnsi="맑은 고딕"/>
+                <w:b w:val="0"/>
+                <w:sz w:val="18"/>
+                <w:rFonts w:eastAsia="맑은 고딕"/>
+              </w:rPr>
+              <w:t>로그인 계정(기본값)</w:t>
+            </w:r>
+          </w:p>
+        </w:tc>
+        <w:tc>
+          <w:tcPr>
+            <w:tcW w:type="dxa" w:w="2166"/>
+          </w:tcPr>
+          <w:p>
+            <w:r/>
+            <w:r>
+              <w:rPr>
+                <w:rFonts w:ascii="맑은 고딕" w:hAnsi="맑은 고딕"/>
+                <w:b w:val="0"/>
+                <w:sz w:val="18"/>
+                <w:rFonts w:eastAsia="맑은 고딕"/>
+              </w:rPr>
+              <w:t>/patient</w:t>
+            </w:r>
+          </w:p>
+        </w:tc>
+        <w:tc>
+          <w:tcPr>
+            <w:tcW w:type="dxa" w:w="2166"/>
+          </w:tcPr>
+          <w:p>
+            <w:r/>
+            <w:r>
+              <w:rPr>
+                <w:rFonts w:ascii="맑은 고딕" w:hAnsi="맑은 고딕"/>
+                <w:b w:val="0"/>
+                <w:sz w:val="18"/>
+                <w:rFonts w:eastAsia="맑은 고딕"/>
+              </w:rPr>
+              <w:t>문의·상담·사후관리. 별도 역할 없음이 기본.</w:t>
+            </w:r>
+          </w:p>
+        </w:tc>
+      </w:tr>
+      <w:tr>
+        <w:tc>
+          <w:tcPr>
+            <w:tcW w:type="dxa" w:w="2166"/>
+          </w:tcPr>
+          <w:p>
+            <w:r/>
+            <w:r>
+              <w:rPr>
+                <w:rFonts w:ascii="맑은 고딕" w:hAnsi="맑은 고딕"/>
+                <w:b/>
+                <w:sz w:val="18"/>
+                <w:rFonts w:eastAsia="맑은 고딕"/>
+              </w:rPr>
+              <w:t>코디네이터</w:t>
+            </w:r>
+          </w:p>
+        </w:tc>
+        <w:tc>
+          <w:tcPr>
+            <w:tcW w:type="dxa" w:w="2166"/>
+          </w:tcPr>
+          <w:p>
+            <w:r/>
+            <w:r>
+              <w:rPr>
+                <w:rFonts w:ascii="맑은 고딕" w:hAnsi="맑은 고딕"/>
+                <w:b w:val="0"/>
+                <w:sz w:val="18"/>
+                <w:rFonts w:eastAsia="맑은 고딕"/>
+              </w:rPr>
+              <w:t>app_metadata.role</w:t>
+            </w:r>
+          </w:p>
+        </w:tc>
+        <w:tc>
+          <w:tcPr>
+            <w:tcW w:type="dxa" w:w="2166"/>
+          </w:tcPr>
+          <w:p>
+            <w:r/>
+            <w:r>
+              <w:rPr>
+                <w:rFonts w:ascii="맑은 고딕" w:hAnsi="맑은 고딕"/>
+                <w:b w:val="0"/>
+                <w:sz w:val="18"/>
+                <w:rFonts w:eastAsia="맑은 고딕"/>
+              </w:rPr>
+              <w:t>/coordinator</w:t>
+            </w:r>
+          </w:p>
+        </w:tc>
+        <w:tc>
+          <w:tcPr>
+            <w:tcW w:type="dxa" w:w="2166"/>
+          </w:tcPr>
+          <w:p>
+            <w:r/>
+            <w:r>
+              <w:rPr>
+                <w:rFonts w:ascii="맑은 고딕" w:hAnsi="맑은 고딕"/>
+                <w:b w:val="0"/>
+                <w:sz w:val="18"/>
+                <w:rFonts w:eastAsia="맑은 고딕"/>
+              </w:rPr>
+              <w:t>내부 스태프. 환자 여정·상담 일정·증상 알림 관리.</w:t>
+            </w:r>
+          </w:p>
+        </w:tc>
+      </w:tr>
+      <w:tr>
+        <w:tc>
+          <w:tcPr>
+            <w:tcW w:type="dxa" w:w="2166"/>
+          </w:tcPr>
+          <w:p>
+            <w:r/>
+            <w:r>
+              <w:rPr>
+                <w:rFonts w:ascii="맑은 고딕" w:hAnsi="맑은 고딕"/>
+                <w:b/>
+                <w:sz w:val="18"/>
+                <w:rFonts w:eastAsia="맑은 고딕"/>
+              </w:rPr>
+              <w:t>관리자</w:t>
+            </w:r>
+          </w:p>
+        </w:tc>
+        <w:tc>
+          <w:tcPr>
+            <w:tcW w:type="dxa" w:w="2166"/>
+          </w:tcPr>
+          <w:p>
+            <w:r/>
+            <w:r>
+              <w:rPr>
+                <w:rFonts w:ascii="맑은 고딕" w:hAnsi="맑은 고딕"/>
+                <w:b w:val="0"/>
+                <w:sz w:val="18"/>
+                <w:rFonts w:eastAsia="맑은 고딕"/>
+              </w:rPr>
+              <w:t>app_metadata.role</w:t>
+            </w:r>
+          </w:p>
+        </w:tc>
+        <w:tc>
+          <w:tcPr>
+            <w:tcW w:type="dxa" w:w="2166"/>
+          </w:tcPr>
+          <w:p>
+            <w:r/>
+            <w:r>
+              <w:rPr>
+                <w:rFonts w:ascii="맑은 고딕" w:hAnsi="맑은 고딕"/>
+                <w:b w:val="0"/>
+                <w:sz w:val="18"/>
+                <w:rFonts w:eastAsia="맑은 고딕"/>
+              </w:rPr>
+              <w:t>/admin</w:t>
+            </w:r>
+          </w:p>
+        </w:tc>
+        <w:tc>
+          <w:tcPr>
+            <w:tcW w:type="dxa" w:w="2166"/>
+          </w:tcPr>
+          <w:p>
+            <w:r/>
+            <w:r>
+              <w:rPr>
+                <w:rFonts w:ascii="맑은 고딕" w:hAnsi="맑은 고딕"/>
+                <w:b w:val="0"/>
+                <w:sz w:val="18"/>
+                <w:rFonts w:eastAsia="맑은 고딕"/>
+              </w:rPr>
+              <w:t>운영자. 전체 권한. 통합 콘솔에서 코디 화면까지 포함.</w:t>
+            </w:r>
+          </w:p>
+        </w:tc>
+      </w:tr>
+      <w:tr>
+        <w:tc>
+          <w:tcPr>
+            <w:tcW w:type="dxa" w:w="2166"/>
+          </w:tcPr>
+          <w:p>
+            <w:r/>
+            <w:r>
+              <w:rPr>
+                <w:rFonts w:ascii="맑은 고딕" w:hAnsi="맑은 고딕"/>
+                <w:b/>
+                <w:sz w:val="18"/>
+                <w:rFonts w:eastAsia="맑은 고딕"/>
+              </w:rPr>
+              <w:t>국내 의료기관</w:t>
+            </w:r>
+          </w:p>
+        </w:tc>
+        <w:tc>
+          <w:tcPr>
+            <w:tcW w:type="dxa" w:w="2166"/>
+          </w:tcPr>
+          <w:p>
+            <w:r/>
+            <w:r>
+              <w:rPr>
+                <w:rFonts w:ascii="맑은 고딕" w:hAnsi="맑은 고딕"/>
+                <w:b w:val="0"/>
+                <w:sz w:val="18"/>
+                <w:rFonts w:eastAsia="맑은 고딕"/>
+              </w:rPr>
+              <w:t>hospital_users 테이블</w:t>
+            </w:r>
+          </w:p>
+        </w:tc>
+        <w:tc>
+          <w:tcPr>
+            <w:tcW w:type="dxa" w:w="2166"/>
+          </w:tcPr>
+          <w:p>
+            <w:r/>
+            <w:r>
+              <w:rPr>
+                <w:rFonts w:ascii="맑은 고딕" w:hAnsi="맑은 고딕"/>
+                <w:b w:val="0"/>
+                <w:sz w:val="18"/>
+                <w:rFonts w:eastAsia="맑은 고딕"/>
+              </w:rPr>
+              <w:t>/hospital</w:t>
+            </w:r>
+          </w:p>
+        </w:tc>
+        <w:tc>
+          <w:tcPr>
+            <w:tcW w:type="dxa" w:w="2166"/>
+          </w:tcPr>
+          <w:p>
+            <w:r/>
+            <w:r>
+              <w:rPr>
+                <w:rFonts w:ascii="맑은 고딕" w:hAnsi="맑은 고딕"/>
+                <w:b w:val="0"/>
+                <w:sz w:val="18"/>
+                <w:rFonts w:eastAsia="맑은 고딕"/>
+              </w:rPr>
+              <w:t>제휴 한국 병원 담당자(owner/manager/viewer). 리드·프로필·치료정보 관리.</w:t>
+            </w:r>
+          </w:p>
+        </w:tc>
+      </w:tr>
+      <w:tr>
+        <w:tc>
+          <w:tcPr>
+            <w:tcW w:type="dxa" w:w="2166"/>
+          </w:tcPr>
+          <w:p>
+            <w:r/>
+            <w:r>
+              <w:rPr>
+                <w:rFonts w:ascii="맑은 고딕" w:hAnsi="맑은 고딕"/>
+                <w:b/>
+                <w:sz w:val="18"/>
+                <w:rFonts w:eastAsia="맑은 고딕"/>
+              </w:rPr>
+              <w:t>해외 에이전시</w:t>
+            </w:r>
+          </w:p>
+        </w:tc>
+        <w:tc>
+          <w:tcPr>
+            <w:tcW w:type="dxa" w:w="2166"/>
+          </w:tcPr>
+          <w:p>
+            <w:r/>
+            <w:r>
+              <w:rPr>
+                <w:rFonts w:ascii="맑은 고딕" w:hAnsi="맑은 고딕"/>
+                <w:b w:val="0"/>
+                <w:sz w:val="18"/>
+                <w:rFonts w:eastAsia="맑은 고딕"/>
+              </w:rPr>
+              <w:t>agency_users + partner_type</w:t>
+            </w:r>
+          </w:p>
+        </w:tc>
+        <w:tc>
+          <w:tcPr>
+            <w:tcW w:type="dxa" w:w="2166"/>
+          </w:tcPr>
+          <w:p>
+            <w:r/>
+            <w:r>
+              <w:rPr>
+                <w:rFonts w:ascii="맑은 고딕" w:hAnsi="맑은 고딕"/>
+                <w:b w:val="0"/>
+                <w:sz w:val="18"/>
+                <w:rFonts w:eastAsia="맑은 고딕"/>
+              </w:rPr>
+              <w:t>/agency</w:t>
+            </w:r>
+          </w:p>
+        </w:tc>
+        <w:tc>
+          <w:tcPr>
+            <w:tcW w:type="dxa" w:w="2166"/>
+          </w:tcPr>
+          <w:p>
+            <w:r/>
+            <w:r>
+              <w:rPr>
+                <w:rFonts w:ascii="맑은 고딕" w:hAnsi="맑은 고딕"/>
+                <w:b w:val="0"/>
+                <w:sz w:val="18"/>
+                <w:rFonts w:eastAsia="맑은 고딕"/>
+              </w:rPr>
+              <w:t>해외 환자 유치 파트너. 의뢰 환자 진행상황 조회.</w:t>
+            </w:r>
+          </w:p>
+        </w:tc>
+      </w:tr>
+      <w:tr>
+        <w:tc>
+          <w:tcPr>
+            <w:tcW w:type="dxa" w:w="2166"/>
+          </w:tcPr>
+          <w:p>
+            <w:r/>
+            <w:r>
+              <w:rPr>
+                <w:rFonts w:ascii="맑은 고딕" w:hAnsi="맑은 고딕"/>
+                <w:b/>
+                <w:sz w:val="18"/>
+                <w:rFonts w:eastAsia="맑은 고딕"/>
+              </w:rPr>
+              <w:t>해외 의료기관</w:t>
+            </w:r>
+          </w:p>
+        </w:tc>
+        <w:tc>
+          <w:tcPr>
+            <w:tcW w:type="dxa" w:w="2166"/>
+          </w:tcPr>
+          <w:p>
+            <w:r/>
+            <w:r>
+              <w:rPr>
+                <w:rFonts w:ascii="맑은 고딕" w:hAnsi="맑은 고딕"/>
+                <w:b w:val="0"/>
+                <w:sz w:val="18"/>
+                <w:rFonts w:eastAsia="맑은 고딕"/>
+              </w:rPr>
+              <w:t>agency_users + partner_type</w:t>
+            </w:r>
+          </w:p>
+        </w:tc>
+        <w:tc>
+          <w:tcPr>
+            <w:tcW w:type="dxa" w:w="2166"/>
+          </w:tcPr>
+          <w:p>
+            <w:r/>
+            <w:r>
+              <w:rPr>
+                <w:rFonts w:ascii="맑은 고딕" w:hAnsi="맑은 고딕"/>
+                <w:b w:val="0"/>
+                <w:sz w:val="18"/>
+                <w:rFonts w:eastAsia="맑은 고딕"/>
+              </w:rPr>
+              <w:t>/clinic</w:t>
+            </w:r>
+          </w:p>
+        </w:tc>
+        <w:tc>
+          <w:tcPr>
+            <w:tcW w:type="dxa" w:w="2166"/>
+          </w:tcPr>
+          <w:p>
+            <w:r/>
+            <w:r>
+              <w:rPr>
+                <w:rFonts w:ascii="맑은 고딕" w:hAnsi="맑은 고딕"/>
+                <w:b w:val="0"/>
+                <w:sz w:val="18"/>
+                <w:rFonts w:eastAsia="맑은 고딕"/>
+              </w:rPr>
+              <w:t>환자를 한국으로 의뢰하는 현지 병원. 경과·검사결과 전송 주체.</w:t>
+            </w:r>
+          </w:p>
+        </w:tc>
+      </w:tr>
+    </w:tbl>
+    <w:p/>
+    <w:p>
+      <w:r>
+        <w:rPr>
+          <w:rFonts w:ascii="맑은 고딕" w:hAnsi="맑은 고딕"/>
+          <w:b/>
+          <w:color w:val="00467F"/>
+          <w:sz w:val="24"/>
+          <w:rFonts w:eastAsia="맑은 고딕"/>
+        </w:rPr>
+        <w:t>2. 화상 상담(원격협진) 기능</w:t>
+      </w:r>
+    </w:p>
+    <w:tbl>
+      <w:tblPr>
+        <w:tblW w:type="auto" w:w="0"/>
+        <w:tblLook w:firstColumn="1" w:firstRow="1" w:lastColumn="0" w:lastRow="0" w:noHBand="0" w:noVBand="1" w:val="04A0"/>
+        <w:tblBorders>
+          <w:top w:val="single" w:sz="4" w:color="999999"/>
+          <w:left w:val="single" w:sz="4" w:color="999999"/>
+          <w:bottom w:val="single" w:sz="4" w:color="999999"/>
+          <w:right w:val="single" w:sz="4" w:color="999999"/>
+          <w:insideH w:val="single" w:sz="4" w:color="999999"/>
+          <w:insideV w:val="single" w:sz="4" w:color="999999"/>
+        </w:tblBorders>
+      </w:tblPr>
+      <w:tblGrid>
+        <w:gridCol w:w="4333"/>
+        <w:gridCol w:w="4333"/>
+      </w:tblGrid>
+      <w:tr>
+        <w:tc>
+          <w:tcPr>
+            <w:tcW w:type="dxa" w:w="4333"/>
+            <w:shd w:val="clear" w:color="auto" w:fill="00467F"/>
+          </w:tcPr>
+          <w:p>
+            <w:r/>
+            <w:r>
+              <w:rPr>
+                <w:rFonts w:ascii="맑은 고딕" w:hAnsi="맑은 고딕"/>
+                <w:b/>
+                <w:color w:val="FFFFFF"/>
+                <w:sz w:val="18"/>
+                <w:rFonts w:eastAsia="맑은 고딕"/>
+              </w:rPr>
+              <w:t>구분</w:t>
+            </w:r>
+          </w:p>
+        </w:tc>
+        <w:tc>
+          <w:tcPr>
+            <w:tcW w:type="dxa" w:w="4333"/>
+            <w:shd w:val="clear" w:color="auto" w:fill="00467F"/>
+          </w:tcPr>
+          <w:p>
+            <w:r/>
+            <w:r>
+              <w:rPr>
+                <w:rFonts w:ascii="맑은 고딕" w:hAnsi="맑은 고딕"/>
+                <w:b/>
+                <w:color w:val="FFFFFF"/>
+                <w:sz w:val="18"/>
+                <w:rFonts w:eastAsia="맑은 고딕"/>
+              </w:rPr>
+              <w:t>내용</w:t>
+            </w:r>
+          </w:p>
+        </w:tc>
+      </w:tr>
+      <w:tr>
+        <w:tc>
+          <w:tcPr>
+            <w:tcW w:type="dxa" w:w="4333"/>
+          </w:tcPr>
+          <w:p>
+            <w:r/>
+            <w:r>
+              <w:rPr>
+                <w:rFonts w:ascii="맑은 고딕" w:hAnsi="맑은 고딕"/>
+                <w:b/>
+                <w:sz w:val="18"/>
+                <w:rFonts w:eastAsia="맑은 고딕"/>
+              </w:rPr>
+              <w:t>영상·음성</w:t>
+            </w:r>
+          </w:p>
+        </w:tc>
+        <w:tc>
+          <w:tcPr>
+            <w:tcW w:type="dxa" w:w="4333"/>
+          </w:tcPr>
+          <w:p>
+            <w:r/>
+            <w:r>
+              <w:rPr>
+                <w:rFonts w:ascii="맑은 고딕" w:hAnsi="맑은 고딕"/>
+                <w:b w:val="0"/>
+                <w:sz w:val="18"/>
+                <w:rFonts w:eastAsia="맑은 고딕"/>
+              </w:rPr>
+              <w:t>LiveKit 기반 WebRTC 다자 통화. 계정 없이 초대링크로 입장.</w:t>
+            </w:r>
+          </w:p>
+        </w:tc>
+      </w:tr>
+      <w:tr>
+        <w:tc>
+          <w:tcPr>
+            <w:tcW w:type="dxa" w:w="4333"/>
+          </w:tcPr>
+          <w:p>
+            <w:r/>
+            <w:r>
+              <w:rPr>
+                <w:rFonts w:ascii="맑은 고딕" w:hAnsi="맑은 고딕"/>
+                <w:b/>
+                <w:sz w:val="18"/>
+                <w:rFonts w:eastAsia="맑은 고딕"/>
+              </w:rPr>
+              <w:t>실시간 자막</w:t>
+            </w:r>
+          </w:p>
+        </w:tc>
+        <w:tc>
+          <w:tcPr>
+            <w:tcW w:type="dxa" w:w="4333"/>
+          </w:tcPr>
+          <w:p>
+            <w:r/>
+            <w:r>
+              <w:rPr>
+                <w:rFonts w:ascii="맑은 고딕" w:hAnsi="맑은 고딕"/>
+                <w:b w:val="0"/>
+                <w:sz w:val="18"/>
+                <w:rFonts w:eastAsia="맑은 고딕"/>
+              </w:rPr>
+              <w:t>발화를 인식해 자막 표시. 화자를 «역할»이 아니라 «사람» 기준으로 구분(색·이름·좌우).</w:t>
+            </w:r>
+          </w:p>
+        </w:tc>
+      </w:tr>
+      <w:tr>
+        <w:tc>
+          <w:tcPr>
+            <w:tcW w:type="dxa" w:w="4333"/>
+          </w:tcPr>
+          <w:p>
+            <w:r/>
+            <w:r>
+              <w:rPr>
+                <w:rFonts w:ascii="맑은 고딕" w:hAnsi="맑은 고딕"/>
+                <w:b/>
+                <w:sz w:val="18"/>
+                <w:rFonts w:eastAsia="맑은 고딕"/>
+              </w:rPr>
+              <w:t>실시간 통역</w:t>
+            </w:r>
+          </w:p>
+        </w:tc>
+        <w:tc>
+          <w:tcPr>
+            <w:tcW w:type="dxa" w:w="4333"/>
+          </w:tcPr>
+          <w:p>
+            <w:r/>
+            <w:r>
+              <w:rPr>
+                <w:rFonts w:ascii="맑은 고딕" w:hAnsi="맑은 고딕"/>
+                <w:b w:val="0"/>
+                <w:sz w:val="18"/>
+                <w:rFonts w:eastAsia="맑은 고딕"/>
+              </w:rPr>
+              <w:t>한국어 ↔ 러시아어 등 상호 번역 자막. 통역 음성 봇 참여 시 음성 통역.</w:t>
+            </w:r>
+          </w:p>
+        </w:tc>
+      </w:tr>
+      <w:tr>
+        <w:tc>
+          <w:tcPr>
+            <w:tcW w:type="dxa" w:w="4333"/>
+          </w:tcPr>
+          <w:p>
+            <w:r/>
+            <w:r>
+              <w:rPr>
+                <w:rFonts w:ascii="맑은 고딕" w:hAnsi="맑은 고딕"/>
+                <w:b/>
+                <w:sz w:val="18"/>
+                <w:rFonts w:eastAsia="맑은 고딕"/>
+              </w:rPr>
+              <w:t>기록</w:t>
+            </w:r>
+          </w:p>
+        </w:tc>
+        <w:tc>
+          <w:tcPr>
+            <w:tcW w:type="dxa" w:w="4333"/>
+          </w:tcPr>
+          <w:p>
+            <w:r/>
+            <w:r>
+              <w:rPr>
+                <w:rFonts w:ascii="맑은 고딕" w:hAnsi="맑은 고딕"/>
+                <w:b w:val="0"/>
+                <w:sz w:val="18"/>
+                <w:rFonts w:eastAsia="맑은 고딕"/>
+              </w:rPr>
+              <w:t>상담 대화·번역 기록을 암호화 저장하여 사후 확인 및 품질 점검에 활용.</w:t>
+            </w:r>
+          </w:p>
+        </w:tc>
+      </w:tr>
+      <w:tr>
+        <w:tc>
+          <w:tcPr>
+            <w:tcW w:type="dxa" w:w="4333"/>
+          </w:tcPr>
+          <w:p>
+            <w:r/>
+            <w:r>
+              <w:rPr>
+                <w:rFonts w:ascii="맑은 고딕" w:hAnsi="맑은 고딕"/>
+                <w:b/>
+                <w:sz w:val="18"/>
+                <w:rFonts w:eastAsia="맑은 고딕"/>
+              </w:rPr>
+              <w:t>안정성</w:t>
+            </w:r>
+          </w:p>
+        </w:tc>
+        <w:tc>
+          <w:tcPr>
+            <w:tcW w:type="dxa" w:w="4333"/>
+          </w:tcPr>
+          <w:p>
+            <w:r/>
+            <w:r>
+              <w:rPr>
+                <w:rFonts w:ascii="맑은 고딕" w:hAnsi="맑은 고딕"/>
+                <w:b w:val="0"/>
+                <w:sz w:val="18"/>
+                <w:rFonts w:eastAsia="맑은 고딕"/>
+              </w:rPr>
+              <w:t>하울링 2단 감지, 무응답 자동 종료, 자막 중단 시 복구 안내.</w:t>
+            </w:r>
+          </w:p>
+        </w:tc>
+      </w:tr>
+    </w:tbl>
+    <w:p/>
+    <w:p>
+      <w:r>
+        <w:rPr>
+          <w:rFonts w:ascii="맑은 고딕" w:hAnsi="맑은 고딕"/>
+          <w:b/>
+          <w:color w:val="00467F"/>
+          <w:sz w:val="24"/>
+          <w:rFonts w:eastAsia="맑은 고딕"/>
+        </w:rPr>
+        <w:t>3. 상담 채널</w:t>
+      </w:r>
+    </w:p>
+    <w:p>
+      <w:r>
+        <w:rPr>
+          <w:rFonts w:ascii="맑은 고딕" w:hAnsi="맑은 고딕"/>
+          <w:b w:val="0"/>
+          <w:sz w:val="18"/>
+          <w:rFonts w:eastAsia="맑은 고딕"/>
+        </w:rPr>
+        <w:t>※ 연동 수준을 구분해 기재한다. 위챗·라인은 메신저 바로가기 안내이며 봇 연동은 미적용이다.</w:t>
+      </w:r>
+    </w:p>
+    <w:tbl>
+      <w:tblPr>
+        <w:tblW w:type="auto" w:w="0"/>
+        <w:tblLook w:firstColumn="1" w:firstRow="1" w:lastColumn="0" w:lastRow="0" w:noHBand="0" w:noVBand="1" w:val="04A0"/>
+        <w:tblBorders>
+          <w:top w:val="single" w:sz="4" w:color="999999"/>
+          <w:left w:val="single" w:sz="4" w:color="999999"/>
+          <w:bottom w:val="single" w:sz="4" w:color="999999"/>
+          <w:right w:val="single" w:sz="4" w:color="999999"/>
+          <w:insideH w:val="single" w:sz="4" w:color="999999"/>
+          <w:insideV w:val="single" w:sz="4" w:color="999999"/>
+        </w:tblBorders>
+      </w:tblPr>
+      <w:tblGrid>
+        <w:gridCol w:w="2889"/>
+        <w:gridCol w:w="2889"/>
+        <w:gridCol w:w="2889"/>
+      </w:tblGrid>
+      <w:tr>
+        <w:tc>
+          <w:tcPr>
+            <w:tcW w:type="dxa" w:w="2889"/>
+            <w:shd w:val="clear" w:color="auto" w:fill="00467F"/>
+          </w:tcPr>
+          <w:p>
+            <w:r/>
+            <w:r>
+              <w:rPr>
+                <w:rFonts w:ascii="맑은 고딕" w:hAnsi="맑은 고딕"/>
+                <w:b/>
+                <w:color w:val="FFFFFF"/>
+                <w:sz w:val="18"/>
+                <w:rFonts w:eastAsia="맑은 고딕"/>
+              </w:rPr>
+              <w:t>채널</w:t>
+            </w:r>
+          </w:p>
+        </w:tc>
+        <w:tc>
+          <w:tcPr>
+            <w:tcW w:type="dxa" w:w="2889"/>
+            <w:shd w:val="clear" w:color="auto" w:fill="00467F"/>
+          </w:tcPr>
+          <w:p>
+            <w:r/>
+            <w:r>
+              <w:rPr>
+                <w:rFonts w:ascii="맑은 고딕" w:hAnsi="맑은 고딕"/>
+                <w:b/>
+                <w:color w:val="FFFFFF"/>
+                <w:sz w:val="18"/>
+                <w:rFonts w:eastAsia="맑은 고딕"/>
+              </w:rPr>
+              <w:t>연동 수준</w:t>
+            </w:r>
+          </w:p>
+        </w:tc>
+        <w:tc>
+          <w:tcPr>
+            <w:tcW w:type="dxa" w:w="2889"/>
+            <w:shd w:val="clear" w:color="auto" w:fill="00467F"/>
+          </w:tcPr>
+          <w:p>
+            <w:r/>
+            <w:r>
+              <w:rPr>
+                <w:rFonts w:ascii="맑은 고딕" w:hAnsi="맑은 고딕"/>
+                <w:b/>
+                <w:color w:val="FFFFFF"/>
+                <w:sz w:val="18"/>
+                <w:rFonts w:eastAsia="맑은 고딕"/>
+              </w:rPr>
+              <w:t>내용</w:t>
+            </w:r>
+          </w:p>
+        </w:tc>
+      </w:tr>
+      <w:tr>
+        <w:tc>
+          <w:tcPr>
+            <w:tcW w:type="dxa" w:w="2889"/>
+          </w:tcPr>
+          <w:p>
+            <w:r/>
+            <w:r>
+              <w:rPr>
+                <w:rFonts w:ascii="맑은 고딕" w:hAnsi="맑은 고딕"/>
+                <w:b/>
+                <w:sz w:val="18"/>
+                <w:rFonts w:eastAsia="맑은 고딕"/>
+              </w:rPr>
+              <w:t>웹 (통합 문의 퍼널)</w:t>
+            </w:r>
+          </w:p>
+        </w:tc>
+        <w:tc>
+          <w:tcPr>
+            <w:tcW w:type="dxa" w:w="2889"/>
+          </w:tcPr>
+          <w:p>
+            <w:r/>
+            <w:r>
+              <w:rPr>
+                <w:rFonts w:ascii="맑은 고딕" w:hAnsi="맑은 고딕"/>
+                <w:b w:val="0"/>
+                <w:sz w:val="18"/>
+                <w:rFonts w:eastAsia="맑은 고딕"/>
+              </w:rPr>
+              <w:t>연동</w:t>
+            </w:r>
+          </w:p>
+        </w:tc>
+        <w:tc>
+          <w:tcPr>
+            <w:tcW w:type="dxa" w:w="2889"/>
+          </w:tcPr>
+          <w:p>
+            <w:r/>
+            <w:r>
+              <w:rPr>
+                <w:rFonts w:ascii="맑은 고딕" w:hAnsi="맑은 고딕"/>
+                <w:b w:val="0"/>
+                <w:sz w:val="18"/>
+                <w:rFonts w:eastAsia="맑은 고딕"/>
+              </w:rPr>
+              <w:t>AI 상담·문의서·상담원 연결. 대화 전체가 기록으로 축적.</w:t>
+            </w:r>
+          </w:p>
+        </w:tc>
+      </w:tr>
+      <w:tr>
+        <w:tc>
+          <w:tcPr>
+            <w:tcW w:type="dxa" w:w="2889"/>
+          </w:tcPr>
+          <w:p>
+            <w:r/>
+            <w:r>
+              <w:rPr>
+                <w:rFonts w:ascii="맑은 고딕" w:hAnsi="맑은 고딕"/>
+                <w:b/>
+                <w:sz w:val="18"/>
+                <w:rFonts w:eastAsia="맑은 고딕"/>
+              </w:rPr>
+              <w:t>텔레그램</w:t>
+            </w:r>
+          </w:p>
+        </w:tc>
+        <w:tc>
+          <w:tcPr>
+            <w:tcW w:type="dxa" w:w="2889"/>
+          </w:tcPr>
+          <w:p>
+            <w:r/>
+            <w:r>
+              <w:rPr>
+                <w:rFonts w:ascii="맑은 고딕" w:hAnsi="맑은 고딕"/>
+                <w:b w:val="0"/>
+                <w:sz w:val="18"/>
+                <w:rFonts w:eastAsia="맑은 고딕"/>
+              </w:rPr>
+              <w:t>연동</w:t>
+            </w:r>
+          </w:p>
+        </w:tc>
+        <w:tc>
+          <w:tcPr>
+            <w:tcW w:type="dxa" w:w="2889"/>
+          </w:tcPr>
+          <w:p>
+            <w:r/>
+            <w:r>
+              <w:rPr>
+                <w:rFonts w:ascii="맑은 고딕" w:hAnsi="맑은 고딕"/>
+                <w:b w:val="0"/>
+                <w:sz w:val="18"/>
+                <w:rFonts w:eastAsia="맑은 고딕"/>
+              </w:rPr>
+              <w:t>봇 웹훅. AI 자동응답 + 스태프 그룹 릴레이 + 상담기록 축적.</w:t>
+            </w:r>
+          </w:p>
+        </w:tc>
+      </w:tr>
+      <w:tr>
+        <w:tc>
+          <w:tcPr>
+            <w:tcW w:type="dxa" w:w="2889"/>
+          </w:tcPr>
+          <w:p>
+            <w:r/>
+            <w:r>
+              <w:rPr>
+                <w:rFonts w:ascii="맑은 고딕" w:hAnsi="맑은 고딕"/>
+                <w:b/>
+                <w:sz w:val="18"/>
+                <w:rFonts w:eastAsia="맑은 고딕"/>
+              </w:rPr>
+              <w:t>왓츠앱</w:t>
+            </w:r>
+          </w:p>
+        </w:tc>
+        <w:tc>
+          <w:tcPr>
+            <w:tcW w:type="dxa" w:w="2889"/>
+          </w:tcPr>
+          <w:p>
+            <w:r/>
+            <w:r>
+              <w:rPr>
+                <w:rFonts w:ascii="맑은 고딕" w:hAnsi="맑은 고딕"/>
+                <w:b w:val="0"/>
+                <w:sz w:val="18"/>
+                <w:rFonts w:eastAsia="맑은 고딕"/>
+              </w:rPr>
+              <w:t>연동</w:t>
+            </w:r>
+          </w:p>
+        </w:tc>
+        <w:tc>
+          <w:tcPr>
+            <w:tcW w:type="dxa" w:w="2889"/>
+          </w:tcPr>
+          <w:p>
+            <w:r/>
+            <w:r>
+              <w:rPr>
+                <w:rFonts w:ascii="맑은 고딕" w:hAnsi="맑은 고딕"/>
+                <w:b w:val="0"/>
+                <w:sz w:val="18"/>
+                <w:rFonts w:eastAsia="맑은 고딕"/>
+              </w:rPr>
+              <w:t>봇 웹훅. AI 자동응답 + 상담기록 축적.</w:t>
+            </w:r>
+          </w:p>
+        </w:tc>
+      </w:tr>
+      <w:tr>
+        <w:tc>
+          <w:tcPr>
+            <w:tcW w:type="dxa" w:w="2889"/>
+          </w:tcPr>
+          <w:p>
+            <w:r/>
+            <w:r>
+              <w:rPr>
+                <w:rFonts w:ascii="맑은 고딕" w:hAnsi="맑은 고딕"/>
+                <w:b/>
+                <w:sz w:val="18"/>
+                <w:rFonts w:eastAsia="맑은 고딕"/>
+              </w:rPr>
+              <w:t>위챗</w:t>
+            </w:r>
+          </w:p>
+        </w:tc>
+        <w:tc>
+          <w:tcPr>
+            <w:tcW w:type="dxa" w:w="2889"/>
+          </w:tcPr>
+          <w:p>
+            <w:r/>
+            <w:r>
+              <w:rPr>
+                <w:rFonts w:ascii="맑은 고딕" w:hAnsi="맑은 고딕"/>
+                <w:b w:val="0"/>
+                <w:sz w:val="18"/>
+                <w:rFonts w:eastAsia="맑은 고딕"/>
+              </w:rPr>
+              <w:t>안내 링크</w:t>
+            </w:r>
+          </w:p>
+        </w:tc>
+        <w:tc>
+          <w:tcPr>
+            <w:tcW w:type="dxa" w:w="2889"/>
+          </w:tcPr>
+          <w:p>
+            <w:r/>
+            <w:r>
+              <w:rPr>
+                <w:rFonts w:ascii="맑은 고딕" w:hAnsi="맑은 고딕"/>
+                <w:b w:val="0"/>
+                <w:sz w:val="18"/>
+                <w:rFonts w:eastAsia="맑은 고딕"/>
+              </w:rPr>
+              <w:t>메신저 바로가기 제공. 봇 연동은 미적용.</w:t>
+            </w:r>
+          </w:p>
+        </w:tc>
+      </w:tr>
+      <w:tr>
+        <w:tc>
+          <w:tcPr>
+            <w:tcW w:type="dxa" w:w="2889"/>
+          </w:tcPr>
+          <w:p>
+            <w:r/>
+            <w:r>
+              <w:rPr>
+                <w:rFonts w:ascii="맑은 고딕" w:hAnsi="맑은 고딕"/>
+                <w:b/>
+                <w:sz w:val="18"/>
+                <w:rFonts w:eastAsia="맑은 고딕"/>
+              </w:rPr>
+              <w:t>라인</w:t>
+            </w:r>
+          </w:p>
+        </w:tc>
+        <w:tc>
+          <w:tcPr>
+            <w:tcW w:type="dxa" w:w="2889"/>
+          </w:tcPr>
+          <w:p>
+            <w:r/>
+            <w:r>
+              <w:rPr>
+                <w:rFonts w:ascii="맑은 고딕" w:hAnsi="맑은 고딕"/>
+                <w:b w:val="0"/>
+                <w:sz w:val="18"/>
+                <w:rFonts w:eastAsia="맑은 고딕"/>
+              </w:rPr>
+              <w:t>안내 링크</w:t>
+            </w:r>
+          </w:p>
+        </w:tc>
+        <w:tc>
+          <w:tcPr>
+            <w:tcW w:type="dxa" w:w="2889"/>
+          </w:tcPr>
+          <w:p>
+            <w:r/>
+            <w:r>
+              <w:rPr>
+                <w:rFonts w:ascii="맑은 고딕" w:hAnsi="맑은 고딕"/>
+                <w:b w:val="0"/>
+                <w:sz w:val="18"/>
+                <w:rFonts w:eastAsia="맑은 고딕"/>
+              </w:rPr>
+              <w:t>메신저 바로가기 제공. 봇 연동은 미적용.</w:t>
+            </w:r>
+          </w:p>
+        </w:tc>
+      </w:tr>
+    </w:tbl>
+    <w:p/>
+    <w:p>
+      <w:r>
+        <w:rPr>
+          <w:rFonts w:ascii="맑은 고딕" w:hAnsi="맑은 고딕"/>
+          <w:b/>
+          <w:color w:val="00467F"/>
+          <w:sz w:val="24"/>
+          <w:rFonts w:eastAsia="맑은 고딕"/>
+        </w:rPr>
+        <w:t>4. 화면 경로 정정 내역</w:t>
+      </w:r>
+    </w:p>
+    <w:p>
+      <w:r>
+        <w:rPr>
+          <w:rFonts w:ascii="맑은 고딕" w:hAnsi="맑은 고딕"/>
+          <w:b w:val="0"/>
+          <w:sz w:val="18"/>
+          <w:rFonts w:eastAsia="맑은 고딕"/>
+        </w:rPr>
+        <w:t>본문에 남아 있던 옛 화면 안내는 아래 기준으로 현행에 맞게 정정하였다. 폐지된 경로는 혼동을 막기 위해 그대로 표기하지 않는다.</w:t>
+      </w:r>
+    </w:p>
+    <w:tbl>
+      <w:tblPr>
+        <w:tblW w:type="auto" w:w="0"/>
+        <w:tblLook w:firstColumn="1" w:firstRow="1" w:lastColumn="0" w:lastRow="0" w:noHBand="0" w:noVBand="1" w:val="04A0"/>
+        <w:tblBorders>
+          <w:top w:val="single" w:sz="4" w:color="999999"/>
+          <w:left w:val="single" w:sz="4" w:color="999999"/>
+          <w:bottom w:val="single" w:sz="4" w:color="999999"/>
+          <w:right w:val="single" w:sz="4" w:color="999999"/>
+          <w:insideH w:val="single" w:sz="4" w:color="999999"/>
+          <w:insideV w:val="single" w:sz="4" w:color="999999"/>
+        </w:tblBorders>
+      </w:tblPr>
+      <w:tblGrid>
+        <w:gridCol w:w="2889"/>
+        <w:gridCol w:w="2889"/>
+        <w:gridCol w:w="2889"/>
+      </w:tblGrid>
+      <w:tr>
+        <w:tc>
+          <w:tcPr>
+            <w:tcW w:type="dxa" w:w="2889"/>
+            <w:shd w:val="clear" w:color="auto" w:fill="00467F"/>
+          </w:tcPr>
+          <w:p>
+            <w:r/>
+            <w:r>
+              <w:rPr>
+                <w:rFonts w:ascii="맑은 고딕" w:hAnsi="맑은 고딕"/>
+                <w:b/>
+                <w:color w:val="FFFFFF"/>
+                <w:sz w:val="18"/>
+                <w:rFonts w:eastAsia="맑은 고딕"/>
+              </w:rPr>
+              <w:t>현행 화면</w:t>
+            </w:r>
+          </w:p>
+        </w:tc>
+        <w:tc>
+          <w:tcPr>
+            <w:tcW w:type="dxa" w:w="2889"/>
+            <w:shd w:val="clear" w:color="auto" w:fill="00467F"/>
+          </w:tcPr>
+          <w:p>
+            <w:r/>
+            <w:r>
+              <w:rPr>
+                <w:rFonts w:ascii="맑은 고딕" w:hAnsi="맑은 고딕"/>
+                <w:b/>
+                <w:color w:val="FFFFFF"/>
+                <w:sz w:val="18"/>
+                <w:rFonts w:eastAsia="맑은 고딕"/>
+              </w:rPr>
+              <w:t>대체한 옛 화면</w:t>
+            </w:r>
+          </w:p>
+        </w:tc>
+        <w:tc>
+          <w:tcPr>
+            <w:tcW w:type="dxa" w:w="2889"/>
+            <w:shd w:val="clear" w:color="auto" w:fill="00467F"/>
+          </w:tcPr>
+          <w:p>
+            <w:r/>
+            <w:r>
+              <w:rPr>
+                <w:rFonts w:ascii="맑은 고딕" w:hAnsi="맑은 고딕"/>
+                <w:b/>
+                <w:color w:val="FFFFFF"/>
+                <w:sz w:val="18"/>
+                <w:rFonts w:eastAsia="맑은 고딕"/>
+              </w:rPr>
+              <w:t>사유</w:t>
+            </w:r>
+          </w:p>
+        </w:tc>
+      </w:tr>
+      <w:tr>
+        <w:tc>
+          <w:tcPr>
+            <w:tcW w:type="dxa" w:w="2889"/>
+          </w:tcPr>
+          <w:p>
+            <w:r/>
+            <w:r>
+              <w:rPr>
+                <w:rFonts w:ascii="맑은 고딕" w:hAnsi="맑은 고딕"/>
+                <w:b/>
+                <w:sz w:val="18"/>
+                <w:rFonts w:eastAsia="맑은 고딕"/>
+              </w:rPr>
+              <w:t>/inquiry</w:t>
+            </w:r>
+          </w:p>
+        </w:tc>
+        <w:tc>
+          <w:tcPr>
+            <w:tcW w:type="dxa" w:w="2889"/>
+          </w:tcPr>
+          <w:p>
+            <w:r/>
+            <w:r>
+              <w:rPr>
+                <w:rFonts w:ascii="맑은 고딕" w:hAnsi="맑은 고딕"/>
+                <w:b w:val="0"/>
+                <w:sz w:val="18"/>
+                <w:rFonts w:eastAsia="맑은 고딕"/>
+              </w:rPr>
+              <w:t>인테이크 화면(별도 경로)</w:t>
+            </w:r>
+          </w:p>
+        </w:tc>
+        <w:tc>
+          <w:tcPr>
+            <w:tcW w:type="dxa" w:w="2889"/>
+          </w:tcPr>
+          <w:p>
+            <w:r/>
+            <w:r>
+              <w:rPr>
+                <w:rFonts w:ascii="맑은 고딕" w:hAnsi="맑은 고딕"/>
+                <w:b w:val="0"/>
+                <w:sz w:val="18"/>
+                <w:rFonts w:eastAsia="맑은 고딕"/>
+              </w:rPr>
+              <w:t>통합 문의 퍼널로 통폐합(영구 리디렉트). 옛 화면은 보관 처리.</w:t>
+            </w:r>
+          </w:p>
+        </w:tc>
+      </w:tr>
+      <w:tr>
+        <w:tc>
+          <w:tcPr>
+            <w:tcW w:type="dxa" w:w="2889"/>
+          </w:tcPr>
+          <w:p>
+            <w:r/>
+            <w:r>
+              <w:rPr>
+                <w:rFonts w:ascii="맑은 고딕" w:hAnsi="맑은 고딕"/>
+                <w:b/>
+                <w:sz w:val="18"/>
+                <w:rFonts w:eastAsia="맑은 고딕"/>
+              </w:rPr>
+              <w:t>/inquiry</w:t>
+            </w:r>
+          </w:p>
+        </w:tc>
+        <w:tc>
+          <w:tcPr>
+            <w:tcW w:type="dxa" w:w="2889"/>
+          </w:tcPr>
+          <w:p>
+            <w:r/>
+            <w:r>
+              <w:rPr>
+                <w:rFonts w:ascii="맑은 고딕" w:hAnsi="맑은 고딕"/>
+                <w:b w:val="0"/>
+                <w:sz w:val="18"/>
+                <w:rFonts w:eastAsia="맑은 고딕"/>
+              </w:rPr>
+              <w:t>상담 시작 화면(별도 경로)</w:t>
+            </w:r>
+          </w:p>
+        </w:tc>
+        <w:tc>
+          <w:tcPr>
+            <w:tcW w:type="dxa" w:w="2889"/>
+          </w:tcPr>
+          <w:p>
+            <w:r/>
+            <w:r>
+              <w:rPr>
+                <w:rFonts w:ascii="맑은 고딕" w:hAnsi="맑은 고딕"/>
+                <w:b w:val="0"/>
+                <w:sz w:val="18"/>
+                <w:rFonts w:eastAsia="맑은 고딕"/>
+              </w:rPr>
+              <w:t>통합 문의 퍼널로 통폐합(영구 리디렉트).</w:t>
+            </w:r>
+          </w:p>
+        </w:tc>
+      </w:tr>
+      <w:tr>
+        <w:tc>
+          <w:tcPr>
+            <w:tcW w:type="dxa" w:w="2889"/>
+          </w:tcPr>
+          <w:p>
+            <w:r/>
+            <w:r>
+              <w:rPr>
+                <w:rFonts w:ascii="맑은 고딕" w:hAnsi="맑은 고딕"/>
+                <w:b/>
+                <w:sz w:val="18"/>
+                <w:rFonts w:eastAsia="맑은 고딕"/>
+              </w:rPr>
+              <w:t>/hospital</w:t>
+            </w:r>
+          </w:p>
+        </w:tc>
+        <w:tc>
+          <w:tcPr>
+            <w:tcW w:type="dxa" w:w="2889"/>
+          </w:tcPr>
+          <w:p>
+            <w:r/>
+            <w:r>
+              <w:rPr>
+                <w:rFonts w:ascii="맑은 고딕" w:hAnsi="맑은 고딕"/>
+                <w:b w:val="0"/>
+                <w:sz w:val="18"/>
+                <w:rFonts w:eastAsia="맑은 고딕"/>
+              </w:rPr>
+              <w:t>파트너 포털 경로</w:t>
+            </w:r>
+          </w:p>
+        </w:tc>
+        <w:tc>
+          <w:tcPr>
+            <w:tcW w:type="dxa" w:w="2889"/>
+          </w:tcPr>
+          <w:p>
+            <w:r/>
+            <w:r>
+              <w:rPr>
+                <w:rFonts w:ascii="맑은 고딕" w:hAnsi="맑은 고딕"/>
+                <w:b w:val="0"/>
+                <w:sz w:val="18"/>
+                <w:rFonts w:eastAsia="맑은 고딕"/>
+              </w:rPr>
+              <w:t>국내 의료기관 포털로 개명. 옛 경로는 존재하지 않음.</w:t>
+            </w:r>
+          </w:p>
+        </w:tc>
+      </w:tr>
+      <w:tr>
+        <w:tc>
+          <w:tcPr>
+            <w:tcW w:type="dxa" w:w="2889"/>
+          </w:tcPr>
+          <w:p>
+            <w:r/>
+            <w:r>
+              <w:rPr>
+                <w:rFonts w:ascii="맑은 고딕" w:hAnsi="맑은 고딕"/>
+                <w:b/>
+                <w:sz w:val="18"/>
+                <w:rFonts w:eastAsia="맑은 고딕"/>
+              </w:rPr>
+              <w:t>(폐지)</w:t>
+            </w:r>
+          </w:p>
+        </w:tc>
+        <w:tc>
+          <w:tcPr>
+            <w:tcW w:type="dxa" w:w="2889"/>
+          </w:tcPr>
+          <w:p>
+            <w:r/>
+            <w:r>
+              <w:rPr>
+                <w:rFonts w:ascii="맑은 고딕" w:hAnsi="맑은 고딕"/>
+                <w:b w:val="0"/>
+                <w:sz w:val="18"/>
+                <w:rFonts w:eastAsia="맑은 고딕"/>
+              </w:rPr>
+              <w:t>의사 전용 화면</w:t>
+            </w:r>
+          </w:p>
+        </w:tc>
+        <w:tc>
+          <w:tcPr>
+            <w:tcW w:type="dxa" w:w="2889"/>
+          </w:tcPr>
+          <w:p>
+            <w:r/>
+            <w:r>
+              <w:rPr>
+                <w:rFonts w:ascii="맑은 고딕" w:hAnsi="맑은 고딕"/>
+                <w:b w:val="0"/>
+                <w:sz w:val="18"/>
+                <w:rFonts w:eastAsia="맑은 고딕"/>
+              </w:rPr>
+              <w:t>의사 계정 계층 폐지. 화상상담 초대링크 또는 병원 계정으로 참여.</w:t>
+            </w:r>
+          </w:p>
+        </w:tc>
+      </w:tr>
+      <w:tr>
+        <w:tc>
+          <w:tcPr>
+            <w:tcW w:type="dxa" w:w="2889"/>
+          </w:tcPr>
+          <w:p>
+            <w:r/>
+            <w:r>
+              <w:rPr>
+                <w:rFonts w:ascii="맑은 고딕" w:hAnsi="맑은 고딕"/>
+                <w:b/>
+                <w:sz w:val="18"/>
+                <w:rFonts w:eastAsia="맑은 고딕"/>
+              </w:rPr>
+              <w:t>/</w:t>
+            </w:r>
+          </w:p>
+        </w:tc>
+        <w:tc>
+          <w:tcPr>
+            <w:tcW w:type="dxa" w:w="2889"/>
+          </w:tcPr>
+          <w:p>
+            <w:r/>
+            <w:r>
+              <w:rPr>
+                <w:rFonts w:ascii="맑은 고딕" w:hAnsi="맑은 고딕"/>
+                <w:b w:val="0"/>
+                <w:sz w:val="18"/>
+                <w:rFonts w:eastAsia="맑은 고딕"/>
+              </w:rPr>
+              <w:t>후기 화면</w:t>
+            </w:r>
+          </w:p>
+        </w:tc>
+        <w:tc>
+          <w:tcPr>
+            <w:tcW w:type="dxa" w:w="2889"/>
+          </w:tcPr>
+          <w:p>
+            <w:r/>
+            <w:r>
+              <w:rPr>
+                <w:rFonts w:ascii="맑은 고딕" w:hAnsi="맑은 고딕"/>
+                <w:b w:val="0"/>
+                <w:sz w:val="18"/>
+                <w:rFonts w:eastAsia="맑은 고딕"/>
+              </w:rPr>
+              <w:t>후기 화면 비활성(홈 리디렉트).</w:t>
+            </w:r>
+          </w:p>
+        </w:tc>
+      </w:tr>
+      <w:tr>
+        <w:tc>
+          <w:tcPr>
+            <w:tcW w:type="dxa" w:w="2889"/>
+          </w:tcPr>
+          <w:p>
+            <w:r/>
+            <w:r>
+              <w:rPr>
+                <w:rFonts w:ascii="맑은 고딕" w:hAnsi="맑은 고딕"/>
+                <w:b/>
+                <w:sz w:val="18"/>
+                <w:rFonts w:eastAsia="맑은 고딕"/>
+              </w:rPr>
+              <w:t>/hospitals</w:t>
+            </w:r>
+          </w:p>
+        </w:tc>
+        <w:tc>
+          <w:tcPr>
+            <w:tcW w:type="dxa" w:w="2889"/>
+          </w:tcPr>
+          <w:p>
+            <w:r/>
+            <w:r>
+              <w:rPr>
+                <w:rFonts w:ascii="맑은 고딕" w:hAnsi="맑은 고딕"/>
+                <w:b w:val="0"/>
+                <w:sz w:val="18"/>
+                <w:rFonts w:eastAsia="맑은 고딕"/>
+              </w:rPr>
+              <w:t>검색 화면</w:t>
+            </w:r>
+          </w:p>
+        </w:tc>
+        <w:tc>
+          <w:tcPr>
+            <w:tcW w:type="dxa" w:w="2889"/>
+          </w:tcPr>
+          <w:p>
+            <w:r/>
+            <w:r>
+              <w:rPr>
+                <w:rFonts w:ascii="맑은 고딕" w:hAnsi="맑은 고딕"/>
+                <w:b w:val="0"/>
+                <w:sz w:val="18"/>
+                <w:rFonts w:eastAsia="맑은 고딕"/>
+              </w:rPr>
+              <w:t>검색 화면 비활성(병원 목록으로 리디렉트).</w:t>
+            </w:r>
+          </w:p>
+        </w:tc>
+      </w:tr>
+    </w:tbl>
+    <w:p/>
+    <w:p>
+      <w:r>
+        <w:rPr>
+          <w:rFonts w:ascii="맑은 고딕" w:hAnsi="맑은 고딕"/>
+          <w:b/>
+          <w:color w:val="00467F"/>
+          <w:sz w:val="24"/>
+          <w:rFonts w:eastAsia="맑은 고딕"/>
+        </w:rPr>
+        <w:t>5. 성과지표 현황</w:t>
+      </w:r>
+    </w:p>
+    <w:p>
+      <w:r>
+        <w:rPr>
+          <w:rFonts w:ascii="맑은 고딕" w:hAnsi="맑은 고딕"/>
+          <w:b w:val="0"/>
+          <w:sz w:val="18"/>
+          <w:rFonts w:eastAsia="맑은 고딕"/>
+        </w:rPr>
+        <w:t>사후관리 계열(④⑤⑥)은 실환자가 치료 완료 단계에 도달해야 실적이 발생하는 구조이므로, 기능 구현 완료와 실데이터 축적은 별개 지표로 관리함. 자동 완료 처리 등 실적을 인위적으로 부풀리는 방식은 채택하지 아니함.</w:t>
+      </w:r>
+    </w:p>
+    <w:tbl>
+      <w:tblPr>
+        <w:tblW w:type="auto" w:w="0"/>
+        <w:tblLook w:firstColumn="1" w:firstRow="1" w:lastColumn="0" w:lastRow="0" w:noHBand="0" w:noVBand="1" w:val="04A0"/>
+        <w:tblBorders>
+          <w:top w:val="single" w:sz="4" w:color="999999"/>
+          <w:left w:val="single" w:sz="4" w:color="999999"/>
+          <w:bottom w:val="single" w:sz="4" w:color="999999"/>
+          <w:right w:val="single" w:sz="4" w:color="999999"/>
+          <w:insideH w:val="single" w:sz="4" w:color="999999"/>
+          <w:insideV w:val="single" w:sz="4" w:color="999999"/>
+        </w:tblBorders>
+      </w:tblPr>
+      <w:tblGrid>
+        <w:gridCol w:w="2889"/>
+        <w:gridCol w:w="2889"/>
+        <w:gridCol w:w="2889"/>
+      </w:tblGrid>
+      <w:tr>
+        <w:tc>
+          <w:tcPr>
+            <w:tcW w:type="dxa" w:w="2889"/>
+            <w:shd w:val="clear" w:color="auto" w:fill="00467F"/>
+          </w:tcPr>
+          <w:p>
+            <w:r/>
+            <w:r>
+              <w:rPr>
+                <w:rFonts w:ascii="맑은 고딕" w:hAnsi="맑은 고딕"/>
+                <w:b/>
+                <w:color w:val="FFFFFF"/>
+                <w:sz w:val="18"/>
+                <w:rFonts w:eastAsia="맑은 고딕"/>
+              </w:rPr>
+              <w:t>지표</w:t>
+            </w:r>
+          </w:p>
+        </w:tc>
+        <w:tc>
+          <w:tcPr>
+            <w:tcW w:type="dxa" w:w="2889"/>
+            <w:shd w:val="clear" w:color="auto" w:fill="00467F"/>
+          </w:tcPr>
+          <w:p>
+            <w:r/>
+            <w:r>
+              <w:rPr>
+                <w:rFonts w:ascii="맑은 고딕" w:hAnsi="맑은 고딕"/>
+                <w:b/>
+                <w:color w:val="FFFFFF"/>
+                <w:sz w:val="18"/>
+                <w:rFonts w:eastAsia="맑은 고딕"/>
+              </w:rPr>
+              <w:t>목표</w:t>
+            </w:r>
+          </w:p>
+        </w:tc>
+        <w:tc>
+          <w:tcPr>
+            <w:tcW w:type="dxa" w:w="2889"/>
+            <w:shd w:val="clear" w:color="auto" w:fill="00467F"/>
+          </w:tcPr>
+          <w:p>
+            <w:r/>
+            <w:r>
+              <w:rPr>
+                <w:rFonts w:ascii="맑은 고딕" w:hAnsi="맑은 고딕"/>
+                <w:b/>
+                <w:color w:val="FFFFFF"/>
+                <w:sz w:val="18"/>
+                <w:rFonts w:eastAsia="맑은 고딕"/>
+              </w:rPr>
+              <w:t>실적(2026. 8. 19.)</w:t>
+            </w:r>
+          </w:p>
+        </w:tc>
+      </w:tr>
+      <w:tr>
+        <w:tc>
+          <w:tcPr>
+            <w:tcW w:type="dxa" w:w="2889"/>
+          </w:tcPr>
+          <w:p>
+            <w:r/>
+            <w:r>
+              <w:rPr>
+                <w:rFonts w:ascii="맑은 고딕" w:hAnsi="맑은 고딕"/>
+                <w:b/>
+                <w:sz w:val="18"/>
+                <w:rFonts w:eastAsia="맑은 고딕"/>
+              </w:rPr>
+              <w:t>외국인환자 유치</w:t>
+            </w:r>
+          </w:p>
+        </w:tc>
+        <w:tc>
+          <w:tcPr>
+            <w:tcW w:type="dxa" w:w="2889"/>
+          </w:tcPr>
+          <w:p>
+            <w:r/>
+            <w:r>
+              <w:rPr>
+                <w:rFonts w:ascii="맑은 고딕" w:hAnsi="맑은 고딕"/>
+                <w:b w:val="0"/>
+                <w:sz w:val="18"/>
+                <w:rFonts w:eastAsia="맑은 고딕"/>
+              </w:rPr>
+              <w:t>12건</w:t>
+            </w:r>
+          </w:p>
+        </w:tc>
+        <w:tc>
+          <w:tcPr>
+            <w:tcW w:type="dxa" w:w="2889"/>
+          </w:tcPr>
+          <w:p>
+            <w:r/>
+            <w:r>
+              <w:rPr>
+                <w:rFonts w:ascii="맑은 고딕" w:hAnsi="맑은 고딕"/>
+                <w:b w:val="0"/>
+                <w:sz w:val="18"/>
+                <w:rFonts w:eastAsia="맑은 고딕"/>
+              </w:rPr>
+              <w:t>0건</w:t>
+            </w:r>
+          </w:p>
+        </w:tc>
+      </w:tr>
+      <w:tr>
+        <w:tc>
+          <w:tcPr>
+            <w:tcW w:type="dxa" w:w="2889"/>
+          </w:tcPr>
+          <w:p>
+            <w:r/>
+            <w:r>
+              <w:rPr>
+                <w:rFonts w:ascii="맑은 고딕" w:hAnsi="맑은 고딕"/>
+                <w:b/>
+                <w:sz w:val="18"/>
+                <w:rFonts w:eastAsia="맑은 고딕"/>
+              </w:rPr>
+              <w:t>사전상담</w:t>
+            </w:r>
+          </w:p>
+        </w:tc>
+        <w:tc>
+          <w:tcPr>
+            <w:tcW w:type="dxa" w:w="2889"/>
+          </w:tcPr>
+          <w:p>
+            <w:r/>
+            <w:r>
+              <w:rPr>
+                <w:rFonts w:ascii="맑은 고딕" w:hAnsi="맑은 고딕"/>
+                <w:b w:val="0"/>
+                <w:sz w:val="18"/>
+                <w:rFonts w:eastAsia="맑은 고딕"/>
+              </w:rPr>
+              <w:t>—</w:t>
+            </w:r>
+          </w:p>
+        </w:tc>
+        <w:tc>
+          <w:tcPr>
+            <w:tcW w:type="dxa" w:w="2889"/>
+          </w:tcPr>
+          <w:p>
+            <w:r/>
+            <w:r>
+              <w:rPr>
+                <w:rFonts w:ascii="맑은 고딕" w:hAnsi="맑은 고딕"/>
+                <w:b w:val="0"/>
+                <w:sz w:val="18"/>
+                <w:rFonts w:eastAsia="맑은 고딕"/>
+              </w:rPr>
+              <w:t>6건</w:t>
+            </w:r>
+          </w:p>
+        </w:tc>
+      </w:tr>
+      <w:tr>
+        <w:tc>
+          <w:tcPr>
+            <w:tcW w:type="dxa" w:w="2889"/>
+          </w:tcPr>
+          <w:p>
+            <w:r/>
+            <w:r>
+              <w:rPr>
+                <w:rFonts w:ascii="맑은 고딕" w:hAnsi="맑은 고딕"/>
+                <w:b/>
+                <w:sz w:val="18"/>
+                <w:rFonts w:eastAsia="맑은 고딕"/>
+              </w:rPr>
+              <w:t>사후관리</w:t>
+            </w:r>
+          </w:p>
+        </w:tc>
+        <w:tc>
+          <w:tcPr>
+            <w:tcW w:type="dxa" w:w="2889"/>
+          </w:tcPr>
+          <w:p>
+            <w:r/>
+            <w:r>
+              <w:rPr>
+                <w:rFonts w:ascii="맑은 고딕" w:hAnsi="맑은 고딕"/>
+                <w:b w:val="0"/>
+                <w:sz w:val="18"/>
+                <w:rFonts w:eastAsia="맑은 고딕"/>
+              </w:rPr>
+              <w:t>—</w:t>
+            </w:r>
+          </w:p>
+        </w:tc>
+        <w:tc>
+          <w:tcPr>
+            <w:tcW w:type="dxa" w:w="2889"/>
+          </w:tcPr>
+          <w:p>
+            <w:r/>
+            <w:r>
+              <w:rPr>
+                <w:rFonts w:ascii="맑은 고딕" w:hAnsi="맑은 고딕"/>
+                <w:b w:val="0"/>
+                <w:sz w:val="18"/>
+                <w:rFonts w:eastAsia="맑은 고딕"/>
+              </w:rPr>
+              <w:t>0건</w:t>
+            </w:r>
+          </w:p>
+        </w:tc>
+      </w:tr>
+      <w:tr>
+        <w:tc>
+          <w:tcPr>
+            <w:tcW w:type="dxa" w:w="2889"/>
+          </w:tcPr>
+          <w:p>
+            <w:r/>
+            <w:r>
+              <w:rPr>
+                <w:rFonts w:ascii="맑은 고딕" w:hAnsi="맑은 고딕"/>
+                <w:b/>
+                <w:sz w:val="18"/>
+                <w:rFonts w:eastAsia="맑은 고딕"/>
+              </w:rPr>
+              <w:t>사전상담+사후관리 합산</w:t>
+            </w:r>
+          </w:p>
+        </w:tc>
+        <w:tc>
+          <w:tcPr>
+            <w:tcW w:type="dxa" w:w="2889"/>
+          </w:tcPr>
+          <w:p>
+            <w:r/>
+            <w:r>
+              <w:rPr>
+                <w:rFonts w:ascii="맑은 고딕" w:hAnsi="맑은 고딕"/>
+                <w:b w:val="0"/>
+                <w:sz w:val="18"/>
+                <w:rFonts w:eastAsia="맑은 고딕"/>
+              </w:rPr>
+              <w:t>120건</w:t>
+            </w:r>
+          </w:p>
+        </w:tc>
+        <w:tc>
+          <w:tcPr>
+            <w:tcW w:type="dxa" w:w="2889"/>
+          </w:tcPr>
+          <w:p>
+            <w:r/>
+            <w:r>
+              <w:rPr>
+                <w:rFonts w:ascii="맑은 고딕" w:hAnsi="맑은 고딕"/>
+                <w:b w:val="0"/>
+                <w:sz w:val="18"/>
+                <w:rFonts w:eastAsia="맑은 고딕"/>
+              </w:rPr>
+              <w:t>6건</w:t>
+            </w:r>
+          </w:p>
+        </w:tc>
+      </w:tr>
+      <w:tr>
+        <w:tc>
+          <w:tcPr>
+            <w:tcW w:type="dxa" w:w="2889"/>
+          </w:tcPr>
+          <w:p>
+            <w:r/>
+            <w:r>
+              <w:rPr>
+                <w:rFonts w:ascii="맑은 고딕" w:hAnsi="맑은 고딕"/>
+                <w:b/>
+                <w:sz w:val="18"/>
+                <w:rFonts w:eastAsia="맑은 고딕"/>
+              </w:rPr>
+              <w:t>환자 만족도</w:t>
+            </w:r>
+          </w:p>
+        </w:tc>
+        <w:tc>
+          <w:tcPr>
+            <w:tcW w:type="dxa" w:w="2889"/>
+          </w:tcPr>
+          <w:p>
+            <w:r/>
+            <w:r>
+              <w:rPr>
+                <w:rFonts w:ascii="맑은 고딕" w:hAnsi="맑은 고딕"/>
+                <w:b w:val="0"/>
+                <w:sz w:val="18"/>
+                <w:rFonts w:eastAsia="맑은 고딕"/>
+              </w:rPr>
+              <w:t>90점</w:t>
+            </w:r>
+          </w:p>
+        </w:tc>
+        <w:tc>
+          <w:tcPr>
+            <w:tcW w:type="dxa" w:w="2889"/>
+          </w:tcPr>
+          <w:p>
+            <w:r/>
+            <w:r>
+              <w:rPr>
+                <w:rFonts w:ascii="맑은 고딕" w:hAnsi="맑은 고딕"/>
+                <w:b w:val="0"/>
+                <w:sz w:val="18"/>
+                <w:rFonts w:eastAsia="맑은 고딕"/>
+              </w:rPr>
+              <w:t>표본 0건</w:t>
+            </w:r>
+          </w:p>
+        </w:tc>
+      </w:tr>
+      <w:tr>
+        <w:tc>
+          <w:tcPr>
+            <w:tcW w:type="dxa" w:w="2889"/>
+          </w:tcPr>
+          <w:p>
+            <w:r/>
+            <w:r>
+              <w:rPr>
+                <w:rFonts w:ascii="맑은 고딕" w:hAnsi="맑은 고딕"/>
+                <w:b/>
+                <w:sz w:val="18"/>
+                <w:rFonts w:eastAsia="맑은 고딕"/>
+              </w:rPr>
+              <w:t>다국어 지원</w:t>
+            </w:r>
+          </w:p>
+        </w:tc>
+        <w:tc>
+          <w:tcPr>
+            <w:tcW w:type="dxa" w:w="2889"/>
+          </w:tcPr>
+          <w:p>
+            <w:r/>
+            <w:r>
+              <w:rPr>
+                <w:rFonts w:ascii="맑은 고딕" w:hAnsi="맑은 고딕"/>
+                <w:b w:val="0"/>
+                <w:sz w:val="18"/>
+                <w:rFonts w:eastAsia="맑은 고딕"/>
+              </w:rPr>
+              <w:t>6개 언어</w:t>
+            </w:r>
+          </w:p>
+        </w:tc>
+        <w:tc>
+          <w:tcPr>
+            <w:tcW w:type="dxa" w:w="2889"/>
+          </w:tcPr>
+          <w:p>
+            <w:r/>
+            <w:r>
+              <w:rPr>
+                <w:rFonts w:ascii="맑은 고딕" w:hAnsi="맑은 고딕"/>
+                <w:b w:val="0"/>
+                <w:sz w:val="18"/>
+                <w:rFonts w:eastAsia="맑은 고딕"/>
+              </w:rPr>
+              <w:t>6개 언어(충족)</w:t>
+            </w:r>
+          </w:p>
+        </w:tc>
+      </w:tr>
+    </w:tbl>
+    <w:p/>
+    <w:p>
+      <w:r>
+        <w:rPr>
+          <w:rFonts w:ascii="맑은 고딕" w:hAnsi="맑은 고딕"/>
+          <w:b w:val="0"/>
+          <w:sz w:val="18"/>
+          <w:rFonts w:eastAsia="맑은 고딕"/>
+        </w:rPr>
+        <w:t>※ 테스트 데이터는 제외한 실건이다. 문의 실건 8건, 상담세션 실건 1건.</w:t>
+      </w:r>
+    </w:p>
+    <w:p>
+      <w:r>
+        <w:rPr>
+          <w:rFonts w:ascii="맑은 고딕" w:hAnsi="맑은 고딕"/>
+          <w:b/>
+          <w:color w:val="00467F"/>
+          <w:sz w:val="24"/>
+          <w:rFonts w:eastAsia="맑은 고딕"/>
+        </w:rPr>
+        <w:t>9. 근거자료</w:t>
+      </w:r>
+    </w:p>
+    <w:tbl>
+      <w:tblPr>
+        <w:tblW w:type="auto" w:w="0"/>
+        <w:tblLook w:firstColumn="1" w:firstRow="1" w:lastColumn="0" w:lastRow="0" w:noHBand="0" w:noVBand="1" w:val="04A0"/>
+        <w:tblBorders>
+          <w:top w:val="single" w:sz="4" w:color="999999"/>
+          <w:left w:val="single" w:sz="4" w:color="999999"/>
+          <w:bottom w:val="single" w:sz="4" w:color="999999"/>
+          <w:right w:val="single" w:sz="4" w:color="999999"/>
+          <w:insideH w:val="single" w:sz="4" w:color="999999"/>
+          <w:insideV w:val="single" w:sz="4" w:color="999999"/>
+        </w:tblBorders>
+      </w:tblPr>
+      <w:tblGrid>
+        <w:gridCol w:w="2889"/>
+        <w:gridCol w:w="2889"/>
+        <w:gridCol w:w="2889"/>
+      </w:tblGrid>
+      <w:tr>
+        <w:tc>
+          <w:tcPr>
+            <w:tcW w:type="dxa" w:w="2889"/>
+            <w:shd w:val="clear" w:color="auto" w:fill="00467F"/>
+          </w:tcPr>
+          <w:p>
+            <w:r/>
+            <w:r>
+              <w:rPr>
+                <w:rFonts w:ascii="맑은 고딕" w:hAnsi="맑은 고딕"/>
+                <w:b/>
+                <w:color w:val="FFFFFF"/>
+                <w:sz w:val="18"/>
+                <w:rFonts w:eastAsia="맑은 고딕"/>
+              </w:rPr>
+              <w:t>구분</w:t>
+            </w:r>
+          </w:p>
+        </w:tc>
+        <w:tc>
+          <w:tcPr>
+            <w:tcW w:type="dxa" w:w="2889"/>
+            <w:shd w:val="clear" w:color="auto" w:fill="00467F"/>
+          </w:tcPr>
+          <w:p>
+            <w:r/>
+            <w:r>
+              <w:rPr>
+                <w:rFonts w:ascii="맑은 고딕" w:hAnsi="맑은 고딕"/>
+                <w:b/>
+                <w:color w:val="FFFFFF"/>
+                <w:sz w:val="18"/>
+                <w:rFonts w:eastAsia="맑은 고딕"/>
+              </w:rPr>
+              <w:t>출처</w:t>
+            </w:r>
+          </w:p>
+        </w:tc>
+        <w:tc>
+          <w:tcPr>
+            <w:tcW w:type="dxa" w:w="2889"/>
+            <w:shd w:val="clear" w:color="auto" w:fill="00467F"/>
+          </w:tcPr>
+          <w:p>
+            <w:r/>
+            <w:r>
+              <w:rPr>
+                <w:rFonts w:ascii="맑은 고딕" w:hAnsi="맑은 고딕"/>
+                <w:b/>
+                <w:color w:val="FFFFFF"/>
+                <w:sz w:val="18"/>
+                <w:rFonts w:eastAsia="맑은 고딕"/>
+              </w:rPr>
+              <w:t>확인 내용</w:t>
+            </w:r>
+          </w:p>
+        </w:tc>
+      </w:tr>
+      <w:tr>
+        <w:tc>
+          <w:tcPr>
+            <w:tcW w:type="dxa" w:w="2889"/>
+          </w:tcPr>
+          <w:p>
+            <w:r/>
+            <w:r>
+              <w:rPr>
+                <w:rFonts w:ascii="맑은 고딕" w:hAnsi="맑은 고딕"/>
+                <w:b/>
+                <w:sz w:val="18"/>
+                <w:rFonts w:eastAsia="맑은 고딕"/>
+              </w:rPr>
+              <w:t>코드</w:t>
+            </w:r>
+          </w:p>
+        </w:tc>
+        <w:tc>
+          <w:tcPr>
+            <w:tcW w:type="dxa" w:w="2889"/>
+          </w:tcPr>
+          <w:p>
+            <w:r/>
+            <w:r>
+              <w:rPr>
+                <w:rFonts w:ascii="맑은 고딕" w:hAnsi="맑은 고딕"/>
+                <w:b w:val="0"/>
+                <w:sz w:val="18"/>
+                <w:rFonts w:eastAsia="맑은 고딕"/>
+              </w:rPr>
+              <w:t>src/lib/auth/accountTiers.ts</w:t>
+            </w:r>
+          </w:p>
+        </w:tc>
+        <w:tc>
+          <w:tcPr>
+            <w:tcW w:type="dxa" w:w="2889"/>
+          </w:tcPr>
+          <w:p>
+            <w:r/>
+            <w:r>
+              <w:rPr>
+                <w:rFonts w:ascii="맑은 고딕" w:hAnsi="맑은 고딕"/>
+                <w:b w:val="0"/>
+                <w:sz w:val="18"/>
+                <w:rFonts w:eastAsia="맑은 고딕"/>
+              </w:rPr>
+              <w:t>계정 계층 7종의 단일 표준</w:t>
+            </w:r>
+          </w:p>
+        </w:tc>
+      </w:tr>
+      <w:tr>
+        <w:tc>
+          <w:tcPr>
+            <w:tcW w:type="dxa" w:w="2889"/>
+          </w:tcPr>
+          <w:p>
+            <w:r/>
+            <w:r>
+              <w:rPr>
+                <w:rFonts w:ascii="맑은 고딕" w:hAnsi="맑은 고딕"/>
+                <w:b/>
+                <w:sz w:val="18"/>
+                <w:rFonts w:eastAsia="맑은 고딕"/>
+              </w:rPr>
+              <w:t>코드</w:t>
+            </w:r>
+          </w:p>
+        </w:tc>
+        <w:tc>
+          <w:tcPr>
+            <w:tcW w:type="dxa" w:w="2889"/>
+          </w:tcPr>
+          <w:p>
+            <w:r/>
+            <w:r>
+              <w:rPr>
+                <w:rFonts w:ascii="맑은 고딕" w:hAnsi="맑은 고딕"/>
+                <w:b w:val="0"/>
+                <w:sz w:val="18"/>
+                <w:rFonts w:eastAsia="맑은 고딕"/>
+              </w:rPr>
+              <w:t>src/lib/khidi/targets.ts</w:t>
+            </w:r>
+          </w:p>
+        </w:tc>
+        <w:tc>
+          <w:tcPr>
+            <w:tcW w:type="dxa" w:w="2889"/>
+          </w:tcPr>
+          <w:p>
+            <w:r/>
+            <w:r>
+              <w:rPr>
+                <w:rFonts w:ascii="맑은 고딕" w:hAnsi="맑은 고딕"/>
+                <w:b w:val="0"/>
+                <w:sz w:val="18"/>
+                <w:rFonts w:eastAsia="맑은 고딕"/>
+              </w:rPr>
+              <w:t>성과지표 공식 목표(12/120/90)</w:t>
+            </w:r>
+          </w:p>
+        </w:tc>
+      </w:tr>
+      <w:tr>
+        <w:tc>
+          <w:tcPr>
+            <w:tcW w:type="dxa" w:w="2889"/>
+          </w:tcPr>
+          <w:p>
+            <w:r/>
+            <w:r>
+              <w:rPr>
+                <w:rFonts w:ascii="맑은 고딕" w:hAnsi="맑은 고딕"/>
+                <w:b/>
+                <w:sz w:val="18"/>
+                <w:rFonts w:eastAsia="맑은 고딕"/>
+              </w:rPr>
+              <w:t>코드</w:t>
+            </w:r>
+          </w:p>
+        </w:tc>
+        <w:tc>
+          <w:tcPr>
+            <w:tcW w:type="dxa" w:w="2889"/>
+          </w:tcPr>
+          <w:p>
+            <w:r/>
+            <w:r>
+              <w:rPr>
+                <w:rFonts w:ascii="맑은 고딕" w:hAnsi="맑은 고딕"/>
+                <w:b w:val="0"/>
+                <w:sz w:val="18"/>
+                <w:rFonts w:eastAsia="맑은 고딕"/>
+              </w:rPr>
+              <w:t>src/lib/khidi/kpi.ts</w:t>
+            </w:r>
+          </w:p>
+        </w:tc>
+        <w:tc>
+          <w:tcPr>
+            <w:tcW w:type="dxa" w:w="2889"/>
+          </w:tcPr>
+          <w:p>
+            <w:r/>
+            <w:r>
+              <w:rPr>
+                <w:rFonts w:ascii="맑은 고딕" w:hAnsi="맑은 고딕"/>
+                <w:b w:val="0"/>
+                <w:sz w:val="18"/>
+                <w:rFonts w:eastAsia="맑은 고딕"/>
+              </w:rPr>
+              <w:t>성과지표 집계 정의(테스트 데이터 제외 규칙 포함)</w:t>
+            </w:r>
+          </w:p>
+        </w:tc>
+      </w:tr>
+      <w:tr>
+        <w:tc>
+          <w:tcPr>
+            <w:tcW w:type="dxa" w:w="2889"/>
+          </w:tcPr>
+          <w:p>
+            <w:r/>
+            <w:r>
+              <w:rPr>
+                <w:rFonts w:ascii="맑은 고딕" w:hAnsi="맑은 고딕"/>
+                <w:b/>
+                <w:sz w:val="18"/>
+                <w:rFonts w:eastAsia="맑은 고딕"/>
+              </w:rPr>
+              <w:t>빌드</w:t>
+            </w:r>
+          </w:p>
+        </w:tc>
+        <w:tc>
+          <w:tcPr>
+            <w:tcW w:type="dxa" w:w="2889"/>
+          </w:tcPr>
+          <w:p>
+            <w:r/>
+            <w:r>
+              <w:rPr>
+                <w:rFonts w:ascii="맑은 고딕" w:hAnsi="맑은 고딕"/>
+                <w:b w:val="0"/>
+                <w:sz w:val="18"/>
+                <w:rFonts w:eastAsia="맑은 고딕"/>
+              </w:rPr>
+              <w:t>Next.js 라우트 목록(CI 빌드 산출)</w:t>
+            </w:r>
+          </w:p>
+        </w:tc>
+        <w:tc>
+          <w:tcPr>
+            <w:tcW w:type="dxa" w:w="2889"/>
+          </w:tcPr>
+          <w:p>
+            <w:r/>
+            <w:r>
+              <w:rPr>
+                <w:rFonts w:ascii="맑은 고딕" w:hAnsi="맑은 고딕"/>
+                <w:b w:val="0"/>
+                <w:sz w:val="18"/>
+                <w:rFonts w:eastAsia="맑은 고딕"/>
+              </w:rPr>
+              <w:t>실제 존재하는 화면 경로</w:t>
+            </w:r>
+          </w:p>
+        </w:tc>
+      </w:tr>
+      <w:tr>
+        <w:tc>
+          <w:tcPr>
+            <w:tcW w:type="dxa" w:w="2889"/>
+          </w:tcPr>
+          <w:p>
+            <w:r/>
+            <w:r>
+              <w:rPr>
+                <w:rFonts w:ascii="맑은 고딕" w:hAnsi="맑은 고딕"/>
+                <w:b/>
+                <w:sz w:val="18"/>
+                <w:rFonts w:eastAsia="맑은 고딕"/>
+              </w:rPr>
+              <w:t>데이터</w:t>
+            </w:r>
+          </w:p>
+        </w:tc>
+        <w:tc>
+          <w:tcPr>
+            <w:tcW w:type="dxa" w:w="2889"/>
+          </w:tcPr>
+          <w:p>
+            <w:r/>
+            <w:r>
+              <w:rPr>
+                <w:rFonts w:ascii="맑은 고딕" w:hAnsi="맑은 고딕"/>
+                <w:b w:val="0"/>
+                <w:sz w:val="18"/>
+                <w:rFonts w:eastAsia="맑은 고딕"/>
+              </w:rPr>
+              <w:t>운영데이터베이스 정확 집계(2026. 8. 19.)</w:t>
             </w:r>
           </w:p>
         </w:tc>

</xml_diff>

<commit_message>
chore: 작업 자동 저장 (2026-08-20 14:47)
</commit_message>
<xml_diff>
--- a/docs/government-project/04_중간보고서.docx
+++ b/docs/government-project/04_중간보고서.docx
@@ -194,7 +194,7 @@
                 <w:sz w:val="20"/>
                 <w:szCs w:val="20"/>
               </w:rPr>
-              <w:t xml:space="preserve">2026년 8월 [예정 — 실제 제출 시 갱신]</w:t>
+              <w:t>2026년 8월 27일 (중간평가일)</w:t>
             </w:r>
           </w:p>
         </w:tc>
@@ -244,7 +244,7 @@
                 <w:sz w:val="20"/>
                 <w:szCs w:val="20"/>
               </w:rPr>
-              <w:t>2026년 8월 19일 (착수 후 5개월 시점)</w:t>
+              <w:t>2026년 8월 20일 (착수 후 5개월 시점)</w:t>
             </w:r>
           </w:p>
         </w:tc>
@@ -3661,7 +3661,7 @@
                 <w:sz w:val="18"/>
                 <w:rFonts w:eastAsia="맑은 고딕"/>
               </w:rPr>
-              <w:t>6건</w:t>
+              <w:t>7건</w:t>
             </w:r>
           </w:p>
         </w:tc>
@@ -3691,7 +3691,7 @@
                 <w:sz w:val="18"/>
                 <w:rFonts w:eastAsia="맑은 고딕"/>
               </w:rPr>
-              <w:t>영상 사전상담 1건 + 환자에게 전달된 소견 5건</w:t>
+              <w:t>영상 사전상담 1건 + 환자에게 전달된 소견 6건</w:t>
             </w:r>
           </w:p>
         </w:tc>
@@ -11114,7 +11114,7 @@
                 <w:sz w:val="18"/>
                 <w:rFonts w:eastAsia="맑은 고딕"/>
               </w:rPr>
-              <w:t>6건</w:t>
+              <w:t>7건</w:t>
             </w:r>
           </w:p>
         </w:tc>
@@ -11220,7 +11220,7 @@
                 <w:sz w:val="18"/>
                 <w:rFonts w:eastAsia="맑은 고딕"/>
               </w:rPr>
-              <w:t>6건</w:t>
+              <w:t>7건</w:t>
             </w:r>
           </w:p>
         </w:tc>

</xml_diff>